<commit_message>
Build real Breely booking webhook integration; sync docs
Replaces the diagnostic capture listener's role for real traffic with a
production webhook (/api/webhooks/breely) that upserts sheet bookings by
external id, claims open Group Event holds instead of blocking on them,
trims the remainder, and force-books plus flags for staff review when
nothing matches - Breely remains the source of truth, this calendar is a
best-effort one-way reflection until real bidirectional sync exists.

Updates the architecture doc, API reference, deployment guide, and staff
guide to match, and regenerates their .docx exports (including the updated
architecture diagram).
</commit_message>
<xml_diff>
--- a/docs/staff-user-guide.docx
+++ b/docs/staff-user-guide.docx
@@ -5,7 +5,7 @@
     <w:p>
       <w:pPr>
         <w:pStyle w:val="Heading1"/>
-        <w:spacing w:after="160" w:before="320"/>
+        <w:spacing w:after="120" w:before="240"/>
       </w:pPr>
       <w:r>
         <w:t xml:space="preserve">Facility Scheduler — Staff User Guide</w:t>
@@ -23,13 +23,9 @@
         <w:t xml:space="preserve">Audience:</w:t>
       </w:r>
       <w:r>
-        <w:t xml:space="preserve"> staff who create, edit, and cancel bookings through the app.</w:t>
-      </w:r>
-    </w:p>
-    <w:p>
-      <w:pPr>
-        <w:spacing w:after="160"/>
-      </w:pPr>
+        <w:t xml:space="preserve"> staff who create, edit, and cancel bookings through the app.
+</w:t>
+      </w:r>
       <w:r>
         <w:rPr>
           <w:b/>
@@ -43,7 +39,10 @@
       <w:r>
         <w:rPr>
           <w:rFonts w:ascii="Consolas" w:cs="Consolas" w:eastAsia="Consolas" w:hAnsi="Consolas"/>
-          <w:shd w:fill="F0F0F0" w:val="clear"/>
+          <w:sz w:val="20"/>
+          <w:szCs w:val="20"/>
+          <w:highlight w:val="lightGray"/>
+          <w:highlightCs w:val="lightGray"/>
         </w:rPr>
         <w:t xml:space="preserve">/calendar</w:t>
       </w:r>
@@ -53,26 +52,22 @@
       <w:r>
         <w:rPr>
           <w:rFonts w:ascii="Consolas" w:cs="Consolas" w:eastAsia="Consolas" w:hAnsi="Consolas"/>
-          <w:shd w:fill="F0F0F0" w:val="clear"/>
+          <w:sz w:val="20"/>
+          <w:szCs w:val="20"/>
+          <w:highlight w:val="lightGray"/>
+          <w:highlightCs w:val="lightGray"/>
         </w:rPr>
         <w:t xml:space="preserve">/club-events</w:t>
       </w:r>
       <w:r>
-        <w:t xml:space="preserve"> pages. The public calendar</w:t>
-      </w:r>
-    </w:p>
-    <w:p>
-      <w:pPr>
-        <w:spacing w:after="160"/>
-      </w:pPr>
-      <w:r>
-        <w:t xml:space="preserve">members see is read-only and needs no instructions.</w:t>
+        <w:t xml:space="preserve"> pages. The public calendar
+members see is read-only and needs no instructions.</w:t>
       </w:r>
     </w:p>
     <w:p>
       <w:pPr>
         <w:pBdr>
-          <w:bottom w:val="single" w:color="AAAAAA" w:sz="6" w:space="1"/>
+          <w:bottom w:val="single" w:color="AAAAAA" w:sz="6"/>
         </w:pBdr>
         <w:spacing w:after="200"/>
       </w:pPr>
@@ -80,7 +75,7 @@
     <w:p>
       <w:pPr>
         <w:pStyle w:val="Heading2"/>
-        <w:spacing w:after="140" w:before="280"/>
+        <w:spacing w:after="120" w:before="240"/>
       </w:pPr>
       <w:r>
         <w:t xml:space="preserve">1. Signing In</w:t>
@@ -91,29 +86,15 @@
         <w:spacing w:after="160"/>
       </w:pPr>
       <w:r>
-        <w:t xml:space="preserve">Navigate to the app's URL and sign in with your normal club Microsoft account when prompted. Sign-in</w:t>
-      </w:r>
-    </w:p>
-    <w:p>
-      <w:pPr>
-        <w:spacing w:after="160"/>
-      </w:pPr>
-      <w:r>
-        <w:t xml:space="preserve">is used for identity/audit purposes — it doesn't change what you can do in the app, just who shows</w:t>
-      </w:r>
-    </w:p>
-    <w:p>
-      <w:pPr>
-        <w:spacing w:after="160"/>
-      </w:pPr>
-      <w:r>
-        <w:t xml:space="preserve">up as "Booked by" on a booking.</w:t>
+        <w:t xml:space="preserve">Navigate to the app's URL and sign in with your normal club Microsoft account when prompted. Sign-in
+is used for identity/audit purposes — it doesn't change what you can do in the app, just who shows
+up as "Booked by" on a booking.</w:t>
       </w:r>
     </w:p>
     <w:p>
       <w:pPr>
         <w:pBdr>
-          <w:bottom w:val="single" w:color="AAAAAA" w:sz="6" w:space="1"/>
+          <w:bottom w:val="single" w:color="AAAAAA" w:sz="6"/>
         </w:pBdr>
         <w:spacing w:after="200"/>
       </w:pPr>
@@ -121,7 +102,7 @@
     <w:p>
       <w:pPr>
         <w:pStyle w:val="Heading2"/>
-        <w:spacing w:after="140" w:before="280"/>
+        <w:spacing w:after="120" w:before="240"/>
       </w:pPr>
       <w:r>
         <w:t xml:space="preserve">2. The Calendar Page</w:t>
@@ -137,7 +118,10 @@
       <w:r>
         <w:rPr>
           <w:rFonts w:ascii="Consolas" w:cs="Consolas" w:eastAsia="Consolas" w:hAnsi="Consolas"/>
-          <w:shd w:fill="F0F0F0" w:val="clear"/>
+          <w:sz w:val="20"/>
+          <w:szCs w:val="20"/>
+          <w:highlight w:val="lightGray"/>
+          <w:highlightCs w:val="lightGray"/>
         </w:rPr>
         <w:t xml:space="preserve">/calendar</w:t>
       </w:r>
@@ -162,13 +146,9 @@
         <w:t xml:space="preserve">Week</w:t>
       </w:r>
       <w:r>
-        <w:t xml:space="preserve">, and</w:t>
-      </w:r>
-    </w:p>
-    <w:p>
-      <w:pPr>
-        <w:spacing w:after="160"/>
-      </w:pPr>
+        <w:t xml:space="preserve">, and
+</w:t>
+      </w:r>
       <w:r>
         <w:rPr>
           <w:b/>
@@ -207,15 +187,8 @@
         <w:t xml:space="preserve">›</w:t>
       </w:r>
       <w:r>
-        <w:t xml:space="preserve"> controls to navigate; clicking a day in Month view, or</w:t>
-      </w:r>
-    </w:p>
-    <w:p>
-      <w:pPr>
-        <w:spacing w:after="160"/>
-      </w:pPr>
-      <w:r>
-        <w:t xml:space="preserve">an empty area of a day column in Week view, jumps to that day's Day view.</w:t>
+        <w:t xml:space="preserve"> controls to navigate; clicking a day in Month view, or
+an empty area of a day column in Week view, jumps to that day's Day view.</w:t>
       </w:r>
     </w:p>
     <w:p>
@@ -230,55 +203,20 @@
         <w:t xml:space="preserve">Week and Day are both hour-by-hour grids</w:t>
       </w:r>
       <w:r>
-        <w:t xml:space="preserve"> covering the full 24-hour day, sharing the same time</w:t>
-      </w:r>
-    </w:p>
-    <w:p>
-      <w:pPr>
-        <w:spacing w:after="160"/>
-      </w:pPr>
-      <w:r>
-        <w:t xml:space="preserve">axis down the left edge — Day view has one column per sheet, Week view has one column per day. If a</w:t>
-      </w:r>
-    </w:p>
-    <w:p>
-      <w:pPr>
-        <w:spacing w:after="160"/>
-      </w:pPr>
-      <w:r>
-        <w:t xml:space="preserve">booking spans multiple sheets at once, Week view shows it as a single item (e.g. "League Practice ·</w:t>
-      </w:r>
-    </w:p>
-    <w:p>
-      <w:pPr>
-        <w:spacing w:after="160"/>
-      </w:pPr>
-      <w:r>
-        <w:t xml:space="preserve">5 sheets") rather than repeating it in every sheet's row. Every cell's title is prefixed with its</w:t>
-      </w:r>
-    </w:p>
-    <w:p>
-      <w:pPr>
-        <w:spacing w:after="160"/>
-      </w:pPr>
-      <w:r>
-        <w:t xml:space="preserve">start time (e.g. "7PM - League Practice"), including in Month view.</w:t>
-      </w:r>
-    </w:p>
-    <w:p>
-      <w:pPr>
-        <w:spacing w:after="160"/>
-      </w:pPr>
-      <w:r>
-        <w:t xml:space="preserve">Club Events (§5) render inline in every view — a pinned row at the top for all-day events, or a</w:t>
-      </w:r>
-    </w:p>
-    <w:p>
-      <w:pPr>
-        <w:spacing w:after="160"/>
-      </w:pPr>
-      <w:r>
-        <w:t xml:space="preserve">full-width band at the right hour for timed ones — with a </w:t>
+        <w:t xml:space="preserve"> covering the full 24-hour day, sharing the same time
+axis down the left edge — Day view has one column per sheet, Week view has one column per day. If a
+booking spans multiple sheets at once, Week view shows it as a single item (e.g. "League Practice ·
+5 sheets") rather than repeating it in every sheet's row. Every cell's title is prefixed with its
+start time (e.g. "7PM - League Practice"), including in Month view.</w:t>
+      </w:r>
+    </w:p>
+    <w:p>
+      <w:pPr>
+        <w:spacing w:after="160"/>
+      </w:pPr>
+      <w:r>
+        <w:t xml:space="preserve">Club Events (§5) render inline in every view — a pinned row at the top for all-day events, or a
+full-width band at the right hour for timed ones — with a </w:t>
       </w:r>
       <w:r>
         <w:rPr>
@@ -288,21 +226,14 @@
         <w:t xml:space="preserve">dotted border</w:t>
       </w:r>
       <w:r>
-        <w:t xml:space="preserve"> distinguishing them from</w:t>
-      </w:r>
-    </w:p>
-    <w:p>
-      <w:pPr>
-        <w:spacing w:after="160"/>
-      </w:pPr>
-      <w:r>
-        <w:t xml:space="preserve">sheet bookings (dashed = Hold, solid = Confirmed).</w:t>
+        <w:t xml:space="preserve"> distinguishing them from
+sheet bookings (dashed = Hold, solid = Confirmed).</w:t>
       </w:r>
     </w:p>
     <w:p>
       <w:pPr>
         <w:pStyle w:val="Heading3"/>
-        <w:spacing w:after="120" w:before="200"/>
+        <w:spacing w:after="120" w:before="240"/>
       </w:pPr>
       <w:r>
         <w:t xml:space="preserve">The SHOW row</w:t>
@@ -313,25 +244,17 @@
         <w:spacing w:after="160"/>
       </w:pPr>
       <w:r>
-        <w:t xml:space="preserve">Below the toolbar, a row of controls filters what's currently displayed — this only affects what you</w:t>
-      </w:r>
-    </w:p>
-    <w:p>
-      <w:pPr>
-        <w:spacing w:after="160"/>
-      </w:pPr>
-      <w:r>
-        <w:t xml:space="preserve">see, not the underlying data:</w:t>
-      </w:r>
-    </w:p>
-    <w:p>
-      <w:pPr>
-        <w:pStyle w:val="ListParagraph"/>
-        <w:numPr>
-          <w:ilvl w:val="0"/>
-          <w:numId w:val="1"/>
-        </w:numPr>
-        <w:spacing w:after="80"/>
+        <w:t xml:space="preserve">Below the toolbar, a row of controls filters what's currently displayed — this only affects what you
+see, not the underlying data:</w:t>
+      </w:r>
+    </w:p>
+    <w:p>
+      <w:pPr>
+        <w:pStyle w:val="ListParagraph"/>
+        <w:numPr>
+          <w:ilvl w:val="0"/>
+          <w:numId w:val="2"/>
+        </w:numPr>
       </w:pPr>
       <w:r>
         <w:rPr>
@@ -341,25 +264,17 @@
         <w:t xml:space="preserve">Category chips</w:t>
       </w:r>
       <w:r>
-        <w:t xml:space="preserve"> (Group Event, League, Bonspiel, Maintenance, Practice Ice, Other) — click to</w:t>
-      </w:r>
-    </w:p>
-    <w:p>
-      <w:pPr>
-        <w:spacing w:after="160"/>
-      </w:pPr>
-      <w:r>
-        <w:t xml:space="preserve">  toggle a category on or off.</w:t>
-      </w:r>
-    </w:p>
-    <w:p>
-      <w:pPr>
-        <w:pStyle w:val="ListParagraph"/>
-        <w:numPr>
-          <w:ilvl w:val="0"/>
-          <w:numId w:val="1"/>
-        </w:numPr>
-        <w:spacing w:after="80"/>
+        <w:t xml:space="preserve"> (Group Event, League, Bonspiel, Maintenance, Practice Ice, Other) — click to
+toggle a category on or off.</w:t>
+      </w:r>
+    </w:p>
+    <w:p>
+      <w:pPr>
+        <w:pStyle w:val="ListParagraph"/>
+        <w:numPr>
+          <w:ilvl w:val="0"/>
+          <w:numId w:val="2"/>
+        </w:numPr>
       </w:pPr>
       <w:r>
         <w:rPr>
@@ -372,10 +287,11 @@
         <w:t xml:space="preserve"> — toggles whether Club Events (§5) appear on the calendar at all.</w:t>
       </w:r>
     </w:p>
+    <w:p/>
     <w:p>
       <w:pPr>
         <w:pBdr>
-          <w:bottom w:val="single" w:color="AAAAAA" w:sz="6" w:space="1"/>
+          <w:bottom w:val="single" w:color="AAAAAA" w:sz="6"/>
         </w:pBdr>
         <w:spacing w:after="200"/>
       </w:pPr>
@@ -383,7 +299,7 @@
     <w:p>
       <w:pPr>
         <w:pStyle w:val="Heading2"/>
-        <w:spacing w:after="140" w:before="280"/>
+        <w:spacing w:after="120" w:before="240"/>
       </w:pPr>
       <w:r>
         <w:t xml:space="preserve">3. Creating a Booking</w:t>
@@ -412,9 +328,8 @@
         <w:pStyle w:val="ListParagraph"/>
         <w:numPr>
           <w:ilvl w:val="0"/>
-          <w:numId w:val="1"/>
-        </w:numPr>
-        <w:spacing w:after="80"/>
+          <w:numId w:val="2"/>
+        </w:numPr>
       </w:pPr>
       <w:r>
         <w:rPr>
@@ -432,9 +347,8 @@
         <w:pStyle w:val="ListParagraph"/>
         <w:numPr>
           <w:ilvl w:val="0"/>
-          <w:numId w:val="1"/>
-        </w:numPr>
-        <w:spacing w:after="80"/>
+          <w:numId w:val="2"/>
+        </w:numPr>
       </w:pPr>
       <w:r>
         <w:rPr>
@@ -447,6 +361,7 @@
         <w:t xml:space="preserve"> — a recurring weekly booking (§4).</w:t>
       </w:r>
     </w:p>
+    <w:p/>
     <w:p>
       <w:pPr>
         <w:spacing w:after="160"/>
@@ -458,7 +373,7 @@
     <w:p>
       <w:pPr>
         <w:pStyle w:val="Heading3"/>
-        <w:spacing w:after="120" w:before="200"/>
+        <w:spacing w:after="120" w:before="240"/>
       </w:pPr>
       <w:r>
         <w:t xml:space="preserve">3.1 The booking form</w:t>
@@ -469,9 +384,8 @@
         <w:pStyle w:val="ListParagraph"/>
         <w:numPr>
           <w:ilvl w:val="0"/>
-          <w:numId w:val="1"/>
-        </w:numPr>
-        <w:spacing w:after="80"/>
+          <w:numId w:val="2"/>
+        </w:numPr>
       </w:pPr>
       <w:r>
         <w:rPr>
@@ -489,9 +403,8 @@
         <w:pStyle w:val="ListParagraph"/>
         <w:numPr>
           <w:ilvl w:val="0"/>
-          <w:numId w:val="1"/>
-        </w:numPr>
-        <w:spacing w:after="80"/>
+          <w:numId w:val="2"/>
+        </w:numPr>
       </w:pPr>
       <w:r>
         <w:rPr>
@@ -510,23 +423,18 @@
         </w:rPr>
         <w:t xml:space="preserve">All Sheets</w:t>
       </w:r>
-    </w:p>
-    <w:p>
-      <w:pPr>
-        <w:spacing w:after="160"/>
-      </w:pPr>
-      <w:r>
-        <w:t xml:space="preserve">  to select every sheet at once. A booking can span multiple sheets as one conceptual unit.</w:t>
-      </w:r>
-    </w:p>
-    <w:p>
-      <w:pPr>
-        <w:pStyle w:val="ListParagraph"/>
-        <w:numPr>
-          <w:ilvl w:val="0"/>
-          <w:numId w:val="1"/>
-        </w:numPr>
-        <w:spacing w:after="80"/>
+      <w:r>
+        <w:t xml:space="preserve">
+to select every sheet at once. A booking can span multiple sheets as one conceptual unit.</w:t>
+      </w:r>
+    </w:p>
+    <w:p>
+      <w:pPr>
+        <w:pStyle w:val="ListParagraph"/>
+        <w:numPr>
+          <w:ilvl w:val="0"/>
+          <w:numId w:val="2"/>
+        </w:numPr>
       </w:pPr>
       <w:r>
         <w:rPr>
@@ -556,25 +464,17 @@
         <w:t xml:space="preserve">To</w:t>
       </w:r>
       <w:r>
-        <w:t xml:space="preserve"> — time fields are in 30-minute increments, covering the full 24-hour</w:t>
-      </w:r>
-    </w:p>
-    <w:p>
-      <w:pPr>
-        <w:spacing w:after="160"/>
-      </w:pPr>
-      <w:r>
-        <w:t xml:space="preserve">  day. The end time must be after the start time.</w:t>
-      </w:r>
-    </w:p>
-    <w:p>
-      <w:pPr>
-        <w:pStyle w:val="ListParagraph"/>
-        <w:numPr>
-          <w:ilvl w:val="0"/>
-          <w:numId w:val="1"/>
-        </w:numPr>
-        <w:spacing w:after="80"/>
+        <w:t xml:space="preserve"> — time fields are in 30-minute increments, covering the full 24-hour
+day. The end time must be after the start time.</w:t>
+      </w:r>
+    </w:p>
+    <w:p>
+      <w:pPr>
+        <w:pStyle w:val="ListParagraph"/>
+        <w:numPr>
+          <w:ilvl w:val="0"/>
+          <w:numId w:val="2"/>
+        </w:numPr>
       </w:pPr>
       <w:r>
         <w:rPr>
@@ -594,33 +494,28 @@
         <w:t xml:space="preserve">Hold for future group event</w:t>
       </w:r>
       <w:r>
-        <w:t xml:space="preserve"> or **Confirmed</w:t>
-      </w:r>
-    </w:p>
-    <w:p>
-      <w:pPr>
-        <w:spacing w:after="160"/>
-      </w:pPr>
-      <w:r>
-        <w:t xml:space="preserve">  booking**. No default; you must pick one. Every other category is always a confirmed (hard)</w:t>
-      </w:r>
-    </w:p>
-    <w:p>
-      <w:pPr>
-        <w:spacing w:after="160"/>
-      </w:pPr>
-      <w:r>
-        <w:t xml:space="preserve">  booking — this toggle doesn't appear for them.</w:t>
-      </w:r>
-    </w:p>
-    <w:p>
-      <w:pPr>
-        <w:pStyle w:val="ListParagraph"/>
-        <w:numPr>
-          <w:ilvl w:val="0"/>
-          <w:numId w:val="1"/>
-        </w:numPr>
-        <w:spacing w:after="80"/>
+        <w:t xml:space="preserve"> or </w:t>
+      </w:r>
+      <w:r>
+        <w:rPr>
+          <w:b/>
+          <w:bCs/>
+        </w:rPr>
+        <w:t xml:space="preserve">Confirmed
+booking</w:t>
+      </w:r>
+      <w:r>
+        <w:t xml:space="preserve">. No default; you must pick one. Every other category is always a confirmed (hard)
+booking — this toggle doesn't appear for them.</w:t>
+      </w:r>
+    </w:p>
+    <w:p>
+      <w:pPr>
+        <w:pStyle w:val="ListParagraph"/>
+        <w:numPr>
+          <w:ilvl w:val="0"/>
+          <w:numId w:val="2"/>
+        </w:numPr>
       </w:pPr>
       <w:r>
         <w:rPr>
@@ -638,9 +533,8 @@
         <w:pStyle w:val="ListParagraph"/>
         <w:numPr>
           <w:ilvl w:val="0"/>
-          <w:numId w:val="1"/>
-        </w:numPr>
-        <w:spacing w:after="80"/>
+          <w:numId w:val="2"/>
+        </w:numPr>
       </w:pPr>
       <w:r>
         <w:rPr>
@@ -663,6 +557,7 @@
         <w:t xml:space="preserve"> (optional, any category).</w:t>
       </w:r>
     </w:p>
+    <w:p/>
     <w:p>
       <w:pPr>
         <w:spacing w:after="160"/>
@@ -678,29 +573,15 @@
         <w:t xml:space="preserve">Save</w:t>
       </w:r>
       <w:r>
-        <w:t xml:space="preserve">. If the requested sheets/time conflict with an existing booking, or with a Club Event</w:t>
-      </w:r>
-    </w:p>
-    <w:p>
-      <w:pPr>
-        <w:spacing w:after="160"/>
-      </w:pPr>
-      <w:r>
-        <w:t xml:space="preserve">flagged as closing all sheets, nothing is saved — a red banner lists exactly what conflicts, and you</w:t>
-      </w:r>
-    </w:p>
-    <w:p>
-      <w:pPr>
-        <w:spacing w:after="160"/>
-      </w:pPr>
-      <w:r>
-        <w:t xml:space="preserve">adjust the sheets or time and try again.</w:t>
+        <w:t xml:space="preserve">. If the requested sheets/time conflict with an existing booking, or with a Club Event
+flagged as closing all sheets, nothing is saved — a red banner lists exactly what conflicts, and you
+adjust the sheets or time and try again.</w:t>
       </w:r>
     </w:p>
     <w:p>
       <w:pPr>
         <w:pBdr>
-          <w:bottom w:val="single" w:color="AAAAAA" w:sz="6" w:space="1"/>
+          <w:bottom w:val="single" w:color="AAAAAA" w:sz="6"/>
         </w:pBdr>
         <w:spacing w:after="200"/>
       </w:pPr>
@@ -708,7 +589,7 @@
     <w:p>
       <w:pPr>
         <w:pStyle w:val="Heading2"/>
-        <w:spacing w:after="140" w:before="280"/>
+        <w:spacing w:after="120" w:before="240"/>
       </w:pPr>
       <w:r>
         <w:t xml:space="preserve">4. Creating a Recurring Series</w:t>
@@ -752,9 +633,8 @@
         <w:pStyle w:val="ListParagraph"/>
         <w:numPr>
           <w:ilvl w:val="0"/>
-          <w:numId w:val="1"/>
-        </w:numPr>
-        <w:spacing w:after="80"/>
+          <w:numId w:val="2"/>
+        </w:numPr>
       </w:pPr>
       <w:r>
         <w:rPr>
@@ -774,17 +654,11 @@
         <w:t xml:space="preserve">Last date</w:t>
       </w:r>
       <w:r>
-        <w:t xml:space="preserve"> — the series repeats weekly on the first date's day of the week,</w:t>
-      </w:r>
-    </w:p>
-    <w:p>
-      <w:pPr>
-        <w:spacing w:after="160"/>
-      </w:pPr>
-      <w:r>
-        <w:t xml:space="preserve">  from the first date through the last date.</w:t>
-      </w:r>
-    </w:p>
+        <w:t xml:space="preserve"> — the series repeats weekly on the first date's day of the week,
+from the first date through the last date.</w:t>
+      </w:r>
+    </w:p>
+    <w:p/>
     <w:p>
       <w:pPr>
         <w:spacing w:after="160"/>
@@ -815,15 +689,8 @@
         <w:t xml:space="preserve">Step 2</w:t>
       </w:r>
       <w:r>
-        <w:t xml:space="preserve"> — every date the series will create is listed. Conflicts (against existing sheet bookings,</w:t>
-      </w:r>
-    </w:p>
-    <w:p>
-      <w:pPr>
-        <w:spacing w:after="160"/>
-      </w:pPr>
-      <w:r>
-        <w:t xml:space="preserve">or a closure Club Event) are flagged per date but </w:t>
+        <w:t xml:space="preserve"> — every date the series will create is listed. Conflicts (against existing sheet bookings,
+or a closure Club Event) are flagged per date but </w:t>
       </w:r>
       <w:r>
         <w:rPr>
@@ -833,15 +700,8 @@
         <w:t xml:space="preserve">never automatically skipped</w:t>
       </w:r>
       <w:r>
-        <w:t xml:space="preserve"> — you decide,</w:t>
-      </w:r>
-    </w:p>
-    <w:p>
-      <w:pPr>
-        <w:spacing w:after="160"/>
-      </w:pPr>
-      <w:r>
-        <w:t xml:space="preserve">per date, using the </w:t>
+        <w:t xml:space="preserve"> — you decide,
+per date, using the </w:t>
       </w:r>
       <w:r>
         <w:rPr>
@@ -871,15 +731,8 @@
         <w:t xml:space="preserve">Create series</w:t>
       </w:r>
       <w:r>
-        <w:t xml:space="preserve"> once you're</w:t>
-      </w:r>
-    </w:p>
-    <w:p>
-      <w:pPr>
-        <w:spacing w:after="160"/>
-      </w:pPr>
-      <w:r>
-        <w:t xml:space="preserve">satisfied with the selection.</w:t>
+        <w:t xml:space="preserve"> once you're
+satisfied with the selection.</w:t>
       </w:r>
     </w:p>
     <w:p>
@@ -894,15 +747,8 @@
         <w:t xml:space="preserve">Editing a series</w:t>
       </w:r>
       <w:r>
-        <w:t xml:space="preserve"> is per-occurrence only — click a single occurrence on the calendar and edit it</w:t>
-      </w:r>
-    </w:p>
-    <w:p>
-      <w:pPr>
-        <w:spacing w:after="160"/>
-      </w:pPr>
-      <w:r>
-        <w:t xml:space="preserve">like a normal booking; there's no "edit the whole series" action. </w:t>
+        <w:t xml:space="preserve"> is per-occurrence only — click a single occurrence on the calendar and edit it
+like a normal booking; there's no "edit the whole series" action. </w:t>
       </w:r>
       <w:r>
         <w:rPr>
@@ -912,37 +758,16 @@
         <w:t xml:space="preserve">Canceling an entire series</w:t>
       </w:r>
       <w:r>
-        <w:t xml:space="preserve"> is a</w:t>
-      </w:r>
-    </w:p>
-    <w:p>
-      <w:pPr>
-        <w:spacing w:after="160"/>
-      </w:pPr>
-      <w:r>
-        <w:t xml:space="preserve">separate, deliberately de-emphasized action available from that occurrence's detail view (§3.2) —</w:t>
-      </w:r>
-    </w:p>
-    <w:p>
-      <w:pPr>
-        <w:spacing w:after="160"/>
-      </w:pPr>
-      <w:r>
-        <w:t xml:space="preserve">meant for correcting a data-entry mistake at the start of a season, not routine cancellations, since</w:t>
-      </w:r>
-    </w:p>
-    <w:p>
-      <w:pPr>
-        <w:spacing w:after="160"/>
-      </w:pPr>
-      <w:r>
-        <w:t xml:space="preserve">it deletes every occurrence, past and future, on every sheet involved.</w:t>
+        <w:t xml:space="preserve"> is a
+separate, deliberately de-emphasized action available from that occurrence's detail view (§3.2) —
+meant for correcting a data-entry mistake at the start of a season, not routine cancellations, since
+it deletes every occurrence, past and future, on every sheet involved.</w:t>
       </w:r>
     </w:p>
     <w:p>
       <w:pPr>
         <w:pStyle w:val="Heading3"/>
-        <w:spacing w:after="120" w:before="200"/>
+        <w:spacing w:after="120" w:before="240"/>
       </w:pPr>
       <w:r>
         <w:t xml:space="preserve">3.2 Editing or canceling a booking</w:t>
@@ -973,33 +798,18 @@
         <w:t xml:space="preserve">Cancel Booking</w:t>
       </w:r>
       <w:r>
-        <w:t xml:space="preserve">,</w:t>
-      </w:r>
-    </w:p>
-    <w:p>
-      <w:pPr>
-        <w:spacing w:after="160"/>
-      </w:pPr>
-      <w:r>
-        <w:t xml:space="preserve">and (only if the booking is part of a recurring series, shown as a smaller link below the main</w:t>
-      </w:r>
-    </w:p>
-    <w:p>
-      <w:pPr>
-        <w:spacing w:after="160"/>
-      </w:pPr>
-      <w:r>
-        <w:t xml:space="preserve">buttons) the option to cancel the entire series instead.</w:t>
-      </w:r>
-    </w:p>
-    <w:p>
-      <w:pPr>
-        <w:pStyle w:val="ListParagraph"/>
-        <w:numPr>
-          <w:ilvl w:val="0"/>
-          <w:numId w:val="1"/>
-        </w:numPr>
-        <w:spacing w:after="80"/>
+        <w:t xml:space="preserve">,
+and (only if the booking is part of a recurring series, shown as a smaller link below the main
+buttons) the option to cancel the entire series instead.</w:t>
+      </w:r>
+    </w:p>
+    <w:p>
+      <w:pPr>
+        <w:pStyle w:val="ListParagraph"/>
+        <w:numPr>
+          <w:ilvl w:val="0"/>
+          <w:numId w:val="2"/>
+        </w:numPr>
       </w:pPr>
       <w:r>
         <w:rPr>
@@ -1009,33 +819,18 @@
         <w:t xml:space="preserve">Edit booking…</w:t>
       </w:r>
       <w:r>
-        <w:t xml:space="preserve"> reopens the same form, pre-filled. If you deselect a sheet that was previously part of a</w:t>
-      </w:r>
-    </w:p>
-    <w:p>
-      <w:pPr>
-        <w:spacing w:after="160"/>
-      </w:pPr>
-      <w:r>
-        <w:t xml:space="preserve">  multi-sheet booking, that sheet is left untouched (not deleted) and split off as its own booking —</w:t>
-      </w:r>
-    </w:p>
-    <w:p>
-      <w:pPr>
-        <w:spacing w:after="160"/>
-      </w:pPr>
-      <w:r>
-        <w:t xml:space="preserve">  it won't keep showing the old renter's details.</w:t>
-      </w:r>
-    </w:p>
-    <w:p>
-      <w:pPr>
-        <w:pStyle w:val="ListParagraph"/>
-        <w:numPr>
-          <w:ilvl w:val="0"/>
-          <w:numId w:val="1"/>
-        </w:numPr>
-        <w:spacing w:after="80"/>
+        <w:t xml:space="preserve"> reopens the same form, pre-filled. If you deselect a sheet that was previously part of a
+multi-sheet booking, that sheet is left untouched (not deleted) and split off as its own booking —
+it won't keep showing the old renter's details.</w:t>
+      </w:r>
+    </w:p>
+    <w:p>
+      <w:pPr>
+        <w:pStyle w:val="ListParagraph"/>
+        <w:numPr>
+          <w:ilvl w:val="0"/>
+          <w:numId w:val="2"/>
+        </w:numPr>
       </w:pPr>
       <w:r>
         <w:rPr>
@@ -1052,10 +847,9 @@
       <w:pPr>
         <w:pStyle w:val="ListParagraph"/>
         <w:numPr>
-          <w:ilvl w:val="0"/>
-          <w:numId w:val="1"/>
-        </w:numPr>
-        <w:spacing w:after="80"/>
+          <w:ilvl w:val="1"/>
+          <w:numId w:val="2"/>
+        </w:numPr>
       </w:pPr>
       <w:r>
         <w:rPr>
@@ -1065,25 +859,17 @@
         <w:t xml:space="preserve">Cancel &amp; reopen for group event</w:t>
       </w:r>
       <w:r>
-        <w:t xml:space="preserve"> (Group Event bookings only) — the slot goes back to an open,</w:t>
-      </w:r>
-    </w:p>
-    <w:p>
-      <w:pPr>
-        <w:spacing w:after="160"/>
-      </w:pPr>
-      <w:r>
-        <w:t xml:space="preserve">    unclaimed Hold, publicly bookable again.</w:t>
-      </w:r>
-    </w:p>
-    <w:p>
-      <w:pPr>
-        <w:pStyle w:val="ListParagraph"/>
-        <w:numPr>
-          <w:ilvl w:val="0"/>
-          <w:numId w:val="1"/>
-        </w:numPr>
-        <w:spacing w:after="80"/>
+        <w:t xml:space="preserve"> (Group Event bookings only) — the slot goes back to an open,
+unclaimed Hold, publicly bookable again.</w:t>
+      </w:r>
+    </w:p>
+    <w:p>
+      <w:pPr>
+        <w:pStyle w:val="ListParagraph"/>
+        <w:numPr>
+          <w:ilvl w:val="1"/>
+          <w:numId w:val="2"/>
+        </w:numPr>
       </w:pPr>
       <w:r>
         <w:rPr>
@@ -1100,10 +886,9 @@
       <w:pPr>
         <w:pStyle w:val="ListParagraph"/>
         <w:numPr>
-          <w:ilvl w:val="0"/>
-          <w:numId w:val="1"/>
-        </w:numPr>
-        <w:spacing w:after="80"/>
+          <w:ilvl w:val="1"/>
+          <w:numId w:val="2"/>
+        </w:numPr>
       </w:pPr>
       <w:r>
         <w:rPr>
@@ -1121,9 +906,8 @@
         <w:pStyle w:val="ListParagraph"/>
         <w:numPr>
           <w:ilvl w:val="0"/>
-          <w:numId w:val="1"/>
-        </w:numPr>
-        <w:spacing w:after="80"/>
+          <w:numId w:val="2"/>
+        </w:numPr>
       </w:pPr>
       <w:r>
         <w:rPr>
@@ -1133,21 +917,15 @@
         <w:t xml:space="preserve">Cancel Series</w:t>
       </w:r>
       <w:r>
-        <w:t xml:space="preserve"> deletes every occurrence of the recurring series on every sheet involved. You'll</w:t>
-      </w:r>
-    </w:p>
-    <w:p>
-      <w:pPr>
-        <w:spacing w:after="160"/>
-      </w:pPr>
-      <w:r>
-        <w:t xml:space="preserve">  be asked to confirm; this can't be undone.</w:t>
-      </w:r>
-    </w:p>
+        <w:t xml:space="preserve"> deletes every occurrence of the recurring series on every sheet involved. You'll
+be asked to confirm; this can't be undone.</w:t>
+      </w:r>
+    </w:p>
+    <w:p/>
     <w:p>
       <w:pPr>
         <w:pBdr>
-          <w:bottom w:val="single" w:color="AAAAAA" w:sz="6" w:space="1"/>
+          <w:bottom w:val="single" w:color="AAAAAA" w:sz="6"/>
         </w:pBdr>
         <w:spacing w:after="200"/>
       </w:pPr>
@@ -1155,7 +933,7 @@
     <w:p>
       <w:pPr>
         <w:pStyle w:val="Heading2"/>
-        <w:spacing w:after="140" w:before="280"/>
+        <w:spacing w:after="120" w:before="240"/>
       </w:pPr>
       <w:r>
         <w:t xml:space="preserve">5. Club Events</w:t>
@@ -1166,15 +944,8 @@
         <w:spacing w:after="160"/>
       </w:pPr>
       <w:r>
-        <w:t xml:space="preserve">Club Events are whole-club events (bonspiels, closures, club activities) that aren't tied to a</w:t>
-      </w:r>
-    </w:p>
-    <w:p>
-      <w:pPr>
-        <w:spacing w:after="160"/>
-      </w:pPr>
-      <w:r>
-        <w:t xml:space="preserve">specific sheet. Reach them either via the </w:t>
+        <w:t xml:space="preserve">Club Events are whole-club events (bonspiels, closures, club activities) that aren't tied to a
+specific sheet. Reach them either via the </w:t>
       </w:r>
       <w:r>
         <w:rPr>
@@ -1184,43 +955,31 @@
         <w:t xml:space="preserve">Club Events</w:t>
       </w:r>
       <w:r>
-        <w:t xml:space="preserve"> button in the calendar toolbar (goes to the</w:t>
-      </w:r>
-    </w:p>
-    <w:p>
-      <w:pPr>
-        <w:spacing w:after="160"/>
-      </w:pPr>
-      <w:r>
-        <w:t xml:space="preserve">dedicated </w:t>
+        <w:t xml:space="preserve"> button in the calendar toolbar (goes to the
+dedicated </w:t>
       </w:r>
       <w:r>
         <w:rPr>
           <w:rFonts w:ascii="Consolas" w:cs="Consolas" w:eastAsia="Consolas" w:hAnsi="Consolas"/>
-          <w:shd w:fill="F0F0F0" w:val="clear"/>
+          <w:sz w:val="20"/>
+          <w:szCs w:val="20"/>
+          <w:highlight w:val="lightGray"/>
+          <w:highlightCs w:val="lightGray"/>
         </w:rPr>
         <w:t xml:space="preserve">/club-events</w:t>
       </w:r>
       <w:r>
-        <w:t xml:space="preserve"> list page) or by clicking a Club Event chip directly on the calendar, which</w:t>
-      </w:r>
-    </w:p>
-    <w:p>
-      <w:pPr>
-        <w:spacing w:after="160"/>
-      </w:pPr>
-      <w:r>
-        <w:t xml:space="preserve">opens the same edit form inline without leaving the calendar page.</w:t>
-      </w:r>
-    </w:p>
-    <w:p>
-      <w:pPr>
-        <w:pStyle w:val="ListParagraph"/>
-        <w:numPr>
-          <w:ilvl w:val="0"/>
-          <w:numId w:val="1"/>
-        </w:numPr>
-        <w:spacing w:after="80"/>
+        <w:t xml:space="preserve"> list page) or by clicking a Club Event chip directly on the calendar, which
+opens the same edit form inline without leaving the calendar page.</w:t>
+      </w:r>
+    </w:p>
+    <w:p>
+      <w:pPr>
+        <w:pStyle w:val="ListParagraph"/>
+        <w:numPr>
+          <w:ilvl w:val="0"/>
+          <w:numId w:val="2"/>
+        </w:numPr>
       </w:pPr>
       <w:r>
         <w:rPr>
@@ -1238,9 +997,8 @@
         <w:pStyle w:val="ListParagraph"/>
         <w:numPr>
           <w:ilvl w:val="0"/>
-          <w:numId w:val="1"/>
-        </w:numPr>
-        <w:spacing w:after="80"/>
+          <w:numId w:val="2"/>
+        </w:numPr>
       </w:pPr>
       <w:r>
         <w:rPr>
@@ -1258,9 +1016,8 @@
         <w:pStyle w:val="ListParagraph"/>
         <w:numPr>
           <w:ilvl w:val="0"/>
-          <w:numId w:val="1"/>
-        </w:numPr>
-        <w:spacing w:after="80"/>
+          <w:numId w:val="2"/>
+        </w:numPr>
       </w:pPr>
       <w:r>
         <w:rPr>
@@ -1290,25 +1047,17 @@
         <w:t xml:space="preserve">To</w:t>
       </w:r>
       <w:r>
-        <w:t xml:space="preserve"> times (same 30-minute increments as</w:t>
-      </w:r>
-    </w:p>
-    <w:p>
-      <w:pPr>
-        <w:spacing w:after="160"/>
-      </w:pPr>
-      <w:r>
-        <w:t xml:space="preserve">  bookings).</w:t>
-      </w:r>
-    </w:p>
-    <w:p>
-      <w:pPr>
-        <w:pStyle w:val="ListParagraph"/>
-        <w:numPr>
-          <w:ilvl w:val="0"/>
-          <w:numId w:val="1"/>
-        </w:numPr>
-        <w:spacing w:after="80"/>
+        <w:t xml:space="preserve"> times (same 30-minute increments as
+bookings).</w:t>
+      </w:r>
+    </w:p>
+    <w:p>
+      <w:pPr>
+        <w:pStyle w:val="ListParagraph"/>
+        <w:numPr>
+          <w:ilvl w:val="0"/>
+          <w:numId w:val="2"/>
+        </w:numPr>
       </w:pPr>
       <w:r>
         <w:rPr>
@@ -1336,9 +1085,8 @@
         <w:pStyle w:val="ListParagraph"/>
         <w:numPr>
           <w:ilvl w:val="0"/>
-          <w:numId w:val="1"/>
-        </w:numPr>
-        <w:spacing w:after="80"/>
+          <w:numId w:val="2"/>
+        </w:numPr>
       </w:pPr>
       <w:r>
         <w:rPr>
@@ -1348,25 +1096,17 @@
         <w:t xml:space="preserve">Marks all sheets unavailable</w:t>
       </w:r>
       <w:r>
-        <w:t xml:space="preserve"> — off by default. Turn this on if the event actually closes the</w:t>
-      </w:r>
-    </w:p>
-    <w:p>
-      <w:pPr>
-        <w:spacing w:after="160"/>
-      </w:pPr>
-      <w:r>
-        <w:t xml:space="preserve">  ice (not every club event does — e.g. a promotional tournament listing might not).</w:t>
-      </w:r>
-    </w:p>
-    <w:p>
-      <w:pPr>
-        <w:pStyle w:val="ListParagraph"/>
-        <w:numPr>
-          <w:ilvl w:val="0"/>
-          <w:numId w:val="1"/>
-        </w:numPr>
-        <w:spacing w:after="80"/>
+        <w:t xml:space="preserve"> — off by default. Turn this on if the event actually closes the
+ice (not every club event does — e.g. a promotional tournament listing might not).</w:t>
+      </w:r>
+    </w:p>
+    <w:p>
+      <w:pPr>
+        <w:pStyle w:val="ListParagraph"/>
+        <w:numPr>
+          <w:ilvl w:val="0"/>
+          <w:numId w:val="2"/>
+        </w:numPr>
       </w:pPr>
       <w:r>
         <w:rPr>
@@ -1379,6 +1119,7 @@
         <w:t xml:space="preserve"> (optional).</w:t>
       </w:r>
     </w:p>
+    <w:p/>
     <w:p>
       <w:pPr>
         <w:spacing w:after="160"/>
@@ -1394,23 +1135,9 @@
         <w:t xml:space="preserve">Marks all sheets unavailable</w:t>
       </w:r>
       <w:r>
-        <w:t xml:space="preserve"> is on, that event is cross-checked against new sheet bookings</w:t>
-      </w:r>
-    </w:p>
-    <w:p>
-      <w:pPr>
-        <w:spacing w:after="160"/>
-      </w:pPr>
-      <w:r>
-        <w:t xml:space="preserve">and series: attempting to book a sheet during that window is blocked (for a single booking) or</w:t>
-      </w:r>
-    </w:p>
-    <w:p>
-      <w:pPr>
-        <w:spacing w:after="160"/>
-      </w:pPr>
-      <w:r>
-        <w:t xml:space="preserve">flagged per-date (for a series preview) the same way a real sheet conflict is.</w:t>
+        <w:t xml:space="preserve"> is on, that event is cross-checked against new sheet bookings
+and series: attempting to book a sheet during that window is blocked (for a single booking) or
+flagged per-date (for a series preview) the same way a real sheet conflict is.</w:t>
       </w:r>
     </w:p>
     <w:p>
@@ -1428,21 +1155,34 @@
         <w:t xml:space="preserve">Delete Club Event</w:t>
       </w:r>
       <w:r>
-        <w:t xml:space="preserve"> link at the bottom of</w:t>
-      </w:r>
-    </w:p>
-    <w:p>
-      <w:pPr>
-        <w:spacing w:after="160"/>
-      </w:pPr>
-      <w:r>
-        <w:t xml:space="preserve">the form.</w:t>
+        <w:t xml:space="preserve"> link at the bottom of
+the form.</w:t>
+      </w:r>
+    </w:p>
+    <w:p>
+      <w:pPr>
+        <w:spacing w:after="160"/>
+      </w:pPr>
+      <w:r>
+        <w:rPr>
+          <w:b/>
+          <w:bCs/>
+        </w:rPr>
+        <w:t xml:space="preserve">A Club Event titled "⚠ Web booking needs review"</w:t>
+      </w:r>
+      <w:r>
+        <w:t xml:space="preserve"> is created automatically, not by staff, when a
+booking notification from the Breely booking website doesn't match any open group-event slot on any
+sheet — the booking is still made (onto a fallback sheet) so it's never lost, but it needs a human to
+check it landed on the right sheet and reassign it if not. Its notes include a link back to that
+booking's page in Breely. It doesn't close any ice itself ("Marks all sheets unavailable" is off) —
+delete it once you've verified or corrected the booking it refers to.</w:t>
       </w:r>
     </w:p>
     <w:p>
       <w:pPr>
         <w:pBdr>
-          <w:bottom w:val="single" w:color="AAAAAA" w:sz="6" w:space="1"/>
+          <w:bottom w:val="single" w:color="AAAAAA" w:sz="6"/>
         </w:pBdr>
         <w:spacing w:after="200"/>
       </w:pPr>
@@ -1450,7 +1190,7 @@
     <w:p>
       <w:pPr>
         <w:pStyle w:val="Heading2"/>
-        <w:spacing w:after="140" w:before="280"/>
+        <w:spacing w:after="120" w:before="240"/>
       </w:pPr>
       <w:r>
         <w:t xml:space="preserve">6. Understanding Conflict Warnings</w:t>
@@ -1469,9 +1209,8 @@
         <w:pStyle w:val="ListParagraph"/>
         <w:numPr>
           <w:ilvl w:val="0"/>
-          <w:numId w:val="1"/>
-        </w:numPr>
-        <w:spacing w:after="80"/>
+          <w:numId w:val="2"/>
+        </w:numPr>
       </w:pPr>
       <w:r>
         <w:rPr>
@@ -1481,20 +1220,16 @@
         <w:t xml:space="preserve">A sheet conflict</w:t>
       </w:r>
       <w:r>
-        <w:t xml:space="preserve"> — another booking already occupies that sheet/time. Shown as</w:t>
-      </w:r>
-    </w:p>
-    <w:p>
-      <w:pPr>
-        <w:spacing w:after="160"/>
-      </w:pPr>
-      <w:r>
-        <w:t xml:space="preserve">  </w:t>
+        <w:t xml:space="preserve"> — another booking already occupies that sheet/time. Shown as
+</w:t>
       </w:r>
       <w:r>
         <w:rPr>
           <w:rFonts w:ascii="Consolas" w:cs="Consolas" w:eastAsia="Consolas" w:hAnsi="Consolas"/>
-          <w:shd w:fill="F0F0F0" w:val="clear"/>
+          <w:sz w:val="20"/>
+          <w:szCs w:val="20"/>
+          <w:highlight w:val="lightGray"/>
+          <w:highlightCs w:val="lightGray"/>
         </w:rPr>
         <w:t xml:space="preserve">Sheet N: &lt;time range&gt; (&lt;category&gt;)</w:t>
       </w:r>
@@ -1507,9 +1242,8 @@
         <w:pStyle w:val="ListParagraph"/>
         <w:numPr>
           <w:ilvl w:val="0"/>
-          <w:numId w:val="1"/>
-        </w:numPr>
-        <w:spacing w:after="80"/>
+          <w:numId w:val="2"/>
+        </w:numPr>
       </w:pPr>
       <w:r>
         <w:rPr>
@@ -1519,20 +1253,16 @@
         <w:t xml:space="preserve">A closure conflict</w:t>
       </w:r>
       <w:r>
-        <w:t xml:space="preserve"> — a Club Event marked "closes all sheets" overlaps the requested time.</w:t>
-      </w:r>
-    </w:p>
-    <w:p>
-      <w:pPr>
-        <w:spacing w:after="160"/>
-      </w:pPr>
-      <w:r>
-        <w:t xml:space="preserve">  Shown as </w:t>
+        <w:t xml:space="preserve"> — a Club Event marked "closes all sheets" overlaps the requested time.
+Shown as </w:t>
       </w:r>
       <w:r>
         <w:rPr>
           <w:rFonts w:ascii="Consolas" w:cs="Consolas" w:eastAsia="Consolas" w:hAnsi="Consolas"/>
-          <w:shd w:fill="F0F0F0" w:val="clear"/>
+          <w:sz w:val="20"/>
+          <w:szCs w:val="20"/>
+          <w:highlight w:val="lightGray"/>
+          <w:highlightCs w:val="lightGray"/>
         </w:rPr>
         <w:t xml:space="preserve">Club event "&lt;title&gt;": &lt;time range&gt; — closes all sheets</w:t>
       </w:r>
@@ -1540,32 +1270,19 @@
         <w:t xml:space="preserve">.</w:t>
       </w:r>
     </w:p>
-    <w:p>
-      <w:pPr>
-        <w:spacing w:after="160"/>
-      </w:pPr>
-      <w:r>
-        <w:t xml:space="preserve">For a single booking or edit, either kind blocks the save entirely — nothing is written until you</w:t>
-      </w:r>
-    </w:p>
-    <w:p>
-      <w:pPr>
-        <w:spacing w:after="160"/>
-      </w:pPr>
-      <w:r>
-        <w:t xml:space="preserve">change the sheets or time. For the series wizard's review step, conflicts are informational: you</w:t>
-      </w:r>
-    </w:p>
-    <w:p>
-      <w:pPr>
-        <w:spacing w:after="160"/>
-      </w:pPr>
-      <w:r>
-        <w:t xml:space="preserve">choose per date whether to skip it or include it anyway.</w:t>
+    <w:p/>
+    <w:p>
+      <w:pPr>
+        <w:spacing w:after="160"/>
+      </w:pPr>
+      <w:r>
+        <w:t xml:space="preserve">For a single booking or edit, either kind blocks the save entirely — nothing is written until you
+change the sheets or time. For the series wizard's review step, conflicts are informational: you
+choose per date whether to skip it or include it anyway.</w:t>
       </w:r>
     </w:p>
     <w:sectPr>
-      <w:pgSz w:w="12240" w:h="15840" w:orient="portrait"/>
+      <w:pgSz w:w="11906" w:h="16838" w:orient="portrait"/>
       <w:pgMar w:top="1440" w:right="1440" w:bottom="1440" w:left="1440" w:header="708" w:footer="708" w:gutter="0"/>
       <w:pgNumType/>
       <w:docGrid w:linePitch="360"/>
@@ -1738,8 +1455,74 @@
       </w:pPr>
     </w:lvl>
   </w:abstractNum>
+  <w:abstractNum w:abstractNumId="2" w15:restartNumberingAfterBreak="0">
+    <w:multiLevelType w:val="hybridMultilevel"/>
+    <w:lvl w:ilvl="0" w15:tentative="1">
+      <w:start w:val="1"/>
+      <w:numFmt w:val="bullet"/>
+      <w:lvlText w:val="•"/>
+      <w:lvlJc w:val="left"/>
+      <w:pPr>
+        <w:ind w:left="360" w:hanging="360"/>
+      </w:pPr>
+    </w:lvl>
+    <w:lvl w:ilvl="1" w15:tentative="1">
+      <w:start w:val="1"/>
+      <w:numFmt w:val="bullet"/>
+      <w:lvlText w:val="•"/>
+      <w:lvlJc w:val="left"/>
+      <w:pPr>
+        <w:ind w:left="720" w:hanging="360"/>
+      </w:pPr>
+    </w:lvl>
+    <w:lvl w:ilvl="2" w15:tentative="1">
+      <w:start w:val="1"/>
+      <w:numFmt w:val="bullet"/>
+      <w:lvlText w:val="•"/>
+      <w:lvlJc w:val="left"/>
+      <w:pPr>
+        <w:ind w:left="1080" w:hanging="360"/>
+      </w:pPr>
+    </w:lvl>
+  </w:abstractNum>
+  <w:abstractNum w:abstractNumId="3" w15:restartNumberingAfterBreak="0">
+    <w:multiLevelType w:val="hybridMultilevel"/>
+    <w:lvl w:ilvl="0" w15:tentative="1">
+      <w:start w:val="1"/>
+      <w:numFmt w:val="decimal"/>
+      <w:lvlText w:val="%1."/>
+      <w:lvlJc w:val="left"/>
+      <w:pPr>
+        <w:ind w:left="360" w:hanging="360"/>
+      </w:pPr>
+    </w:lvl>
+    <w:lvl w:ilvl="1" w15:tentative="1">
+      <w:start w:val="1"/>
+      <w:numFmt w:val="decimal"/>
+      <w:lvlText w:val="%1."/>
+      <w:lvlJc w:val="left"/>
+      <w:pPr>
+        <w:ind w:left="720" w:hanging="360"/>
+      </w:pPr>
+    </w:lvl>
+    <w:lvl w:ilvl="2" w15:tentative="1">
+      <w:start w:val="1"/>
+      <w:numFmt w:val="decimal"/>
+      <w:lvlText w:val="%1."/>
+      <w:lvlJc w:val="left"/>
+      <w:pPr>
+        <w:ind w:left="1080" w:hanging="360"/>
+      </w:pPr>
+    </w:lvl>
+  </w:abstractNum>
   <w:num w:numId="1">
     <w:abstractNumId w:val="1"/>
+    <w:lvlOverride w:ilvl="0">
+      <w:startOverride w:val="1"/>
+    </w:lvlOverride>
+  </w:num>
+  <w:num w:numId="2">
+    <w:abstractNumId w:val="2"/>
     <w:lvlOverride w:ilvl="0">
       <w:startOverride w:val="1"/>
     </w:lvlOverride>
@@ -1750,7 +1533,13 @@
 <file path=word/styles.xml><?xml version="1.0" encoding="utf-8"?>
 <w:styles xmlns:mc="http://schemas.openxmlformats.org/markup-compatibility/2006" xmlns:r="http://schemas.openxmlformats.org/officeDocument/2006/relationships" xmlns:w="http://schemas.openxmlformats.org/wordprocessingml/2006/main" xmlns:w14="http://schemas.microsoft.com/office/word/2010/wordml" xmlns:w15="http://schemas.microsoft.com/office/word/2012/wordml" mc:Ignorable="w14 w15">
   <w:docDefaults>
-    <w:rPrDefault/>
+    <w:rPrDefault>
+      <w:rPr>
+        <w:rFonts w:ascii="Calibri" w:cs="Calibri" w:eastAsia="Calibri" w:hAnsi="Calibri"/>
+        <w:sz w:val="22"/>
+        <w:szCs w:val="22"/>
+      </w:rPr>
+    </w:rPrDefault>
     <w:pPrDefault/>
   </w:docDefaults>
   <w:style w:type="paragraph" w:styleId="Title">
@@ -1768,10 +1557,15 @@
     <w:basedOn w:val="Normal"/>
     <w:next w:val="Normal"/>
     <w:qFormat/>
+    <w:pPr>
+      <w:spacing w:after="160" w:before="320"/>
+    </w:pPr>
     <w:rPr>
-      <w:color w:val="2E74B5"/>
-      <w:sz w:val="32"/>
-      <w:szCs w:val="32"/>
+      <w:b/>
+      <w:bCs/>
+      <w:color w:val="1F3864"/>
+      <w:sz w:val="34"/>
+      <w:szCs w:val="34"/>
     </w:rPr>
   </w:style>
   <w:style w:type="paragraph" w:styleId="Heading2">
@@ -1779,10 +1573,15 @@
     <w:basedOn w:val="Normal"/>
     <w:next w:val="Normal"/>
     <w:qFormat/>
+    <w:pPr>
+      <w:spacing w:after="140" w:before="280"/>
+    </w:pPr>
     <w:rPr>
-      <w:color w:val="2E74B5"/>
-      <w:sz w:val="26"/>
-      <w:szCs w:val="26"/>
+      <w:b/>
+      <w:bCs/>
+      <w:color w:val="1F3864"/>
+      <w:sz w:val="28"/>
+      <w:szCs w:val="28"/>
     </w:rPr>
   </w:style>
   <w:style w:type="paragraph" w:styleId="Heading3">
@@ -1790,10 +1589,15 @@
     <w:basedOn w:val="Normal"/>
     <w:next w:val="Normal"/>
     <w:qFormat/>
+    <w:pPr>
+      <w:spacing w:after="120" w:before="240"/>
+    </w:pPr>
     <w:rPr>
-      <w:color w:val="1F4D78"/>
-      <w:sz w:val="24"/>
-      <w:szCs w:val="24"/>
+      <w:b/>
+      <w:bCs/>
+      <w:color w:val="2E5395"/>
+      <w:sz w:val="25"/>
+      <w:szCs w:val="25"/>
     </w:rPr>
   </w:style>
   <w:style w:type="paragraph" w:styleId="Heading4">
@@ -1801,10 +1605,15 @@
     <w:basedOn w:val="Normal"/>
     <w:next w:val="Normal"/>
     <w:qFormat/>
+    <w:pPr>
+      <w:spacing w:after="100" w:before="200"/>
+    </w:pPr>
     <w:rPr>
-      <w:i/>
-      <w:iCs/>
-      <w:color w:val="2E74B5"/>
+      <w:b/>
+      <w:bCs/>
+      <w:color w:val="2E5395"/>
+      <w:sz w:val="23"/>
+      <w:szCs w:val="23"/>
     </w:rPr>
   </w:style>
   <w:style w:type="paragraph" w:styleId="Heading5">

</xml_diff>